<commit_message>
Add final thesis deliverables and workflow updates
</commit_message>
<xml_diff>
--- a/模板/GDUT-Undergraduate-Thesis-LaTeX-Template-main/论文封面.docx
+++ b/模板/GDUT-Undergraduate-Thesis-LaTeX-Template-main/论文封面.docx
@@ -202,11 +202,10 @@
         <w:jc w:val="center"/>
         <w:textAlignment w:val="baseline"/>
         <w:rPr>
-          <w:rFonts w:ascii="Times New Roman" w:hAnsi="Times New Roman" w:eastAsia="黑体" w:cs="Times New Roman"/>
-          <w:b/>
-          <w:bCs/>
-          <w:sz w:val="44"/>
-          <w:szCs w:val="44"/>
+          <w:rFonts w:hint="default" w:ascii="Times New Roman" w:hAnsi="Times New Roman" w:eastAsia="宋体" w:cs="Times New Roman"/>
+          <w:sz w:val="36"/>
+          <w:szCs w:val="36"/>
+          <w:lang w:val="en-US" w:eastAsia="zh-CN"/>
         </w:rPr>
       </w:pPr>
       <w:r>
@@ -216,61 +215,9 @@
           <w:bCs/>
           <w:sz w:val="44"/>
           <w:szCs w:val="44"/>
-        </w:rPr>
-        <w:t>基于</w:t>
-      </w:r>
-      <w:r>
-        <w:rPr>
-          <w:rFonts w:ascii="Times New Roman" w:hAnsi="Times New Roman" w:eastAsia="黑体" w:cs="Times New Roman"/>
-          <w:b/>
-          <w:bCs/>
-          <w:sz w:val="44"/>
-          <w:szCs w:val="44"/>
-        </w:rPr>
-        <w:t>I</w:t>
-      </w:r>
-      <w:r>
-        <w:rPr>
-          <w:rFonts w:ascii="Times New Roman" w:hAnsi="Times New Roman" w:eastAsia="黑体" w:cs="Times New Roman"/>
-          <w:b/>
-          <w:bCs/>
-          <w:sz w:val="44"/>
-          <w:szCs w:val="44"/>
-          <w:vertAlign w:val="superscript"/>
-        </w:rPr>
-        <w:t>2</w:t>
-      </w:r>
-      <w:r>
-        <w:rPr>
-          <w:rFonts w:ascii="Times New Roman" w:hAnsi="Times New Roman" w:eastAsia="黑体" w:cs="Times New Roman"/>
-          <w:b/>
-          <w:bCs/>
-          <w:sz w:val="44"/>
-          <w:szCs w:val="44"/>
-        </w:rPr>
-        <w:t>C的生物传感器接口控制器</w:t>
-      </w:r>
-    </w:p>
-    <w:p>
-      <w:pPr>
-        <w:widowControl/>
-        <w:jc w:val="center"/>
-        <w:textAlignment w:val="baseline"/>
-        <w:rPr>
-          <w:rFonts w:ascii="Times New Roman" w:hAnsi="Times New Roman" w:eastAsia="宋体" w:cs="Times New Roman"/>
-          <w:sz w:val="36"/>
-          <w:szCs w:val="36"/>
-        </w:rPr>
-      </w:pPr>
-      <w:r>
-        <w:rPr>
-          <w:rFonts w:ascii="Times New Roman" w:hAnsi="Times New Roman" w:eastAsia="黑体" w:cs="Times New Roman"/>
-          <w:b/>
-          <w:bCs/>
-          <w:sz w:val="44"/>
-          <w:szCs w:val="44"/>
-        </w:rPr>
-        <w:t>及信号调理电路设计</w:t>
+          <w:lang w:val="en-US" w:eastAsia="zh-CN"/>
+        </w:rPr>
+        <w:t>你的论文题目</w:t>
       </w:r>
     </w:p>
     <w:p>
@@ -363,8 +310,6 @@
         </w:rPr>
         <w:t xml:space="preserve">     </w:t>
       </w:r>
-      <w:bookmarkStart w:id="0" w:name="_GoBack"/>
-      <w:bookmarkEnd w:id="0"/>
     </w:p>
     <w:p>
       <w:pPr>
@@ -471,7 +416,26 @@
           <w:szCs w:val="32"/>
           <w:u w:val="single"/>
         </w:rPr>
-        <w:t>2022级（2）班</w:t>
+        <w:t>20</w:t>
+      </w:r>
+      <w:r>
+        <w:rPr>
+          <w:rFonts w:hint="eastAsia" w:ascii="Times New Roman" w:hAnsi="Times New Roman" w:eastAsia="黑体" w:cs="Times New Roman"/>
+          <w:sz w:val="32"/>
+          <w:szCs w:val="32"/>
+          <w:u w:val="single"/>
+          <w:lang w:val="en-US" w:eastAsia="zh-CN"/>
+        </w:rPr>
+        <w:t>99</w:t>
+      </w:r>
+      <w:r>
+        <w:rPr>
+          <w:rFonts w:ascii="Times New Roman" w:hAnsi="Times New Roman" w:eastAsia="黑体" w:cs="Times New Roman"/>
+          <w:sz w:val="32"/>
+          <w:szCs w:val="32"/>
+          <w:u w:val="single"/>
+        </w:rPr>
+        <w:t>级（2）班</w:t>
       </w:r>
       <w:r>
         <w:rPr>
@@ -556,7 +520,26 @@
           <w:szCs w:val="32"/>
           <w:u w:val="single"/>
         </w:rPr>
-        <w:t>312200</w:t>
+        <w:t>31</w:t>
+      </w:r>
+      <w:r>
+        <w:rPr>
+          <w:rFonts w:hint="eastAsia" w:ascii="Times New Roman" w:hAnsi="Times New Roman" w:eastAsia="黑体" w:cs="Times New Roman"/>
+          <w:sz w:val="32"/>
+          <w:szCs w:val="32"/>
+          <w:u w:val="single"/>
+          <w:lang w:val="en-US" w:eastAsia="zh-CN"/>
+        </w:rPr>
+        <w:t>99</w:t>
+      </w:r>
+      <w:r>
+        <w:rPr>
+          <w:rFonts w:ascii="Times New Roman" w:hAnsi="Times New Roman" w:eastAsia="黑体" w:cs="Times New Roman"/>
+          <w:sz w:val="32"/>
+          <w:szCs w:val="32"/>
+          <w:u w:val="single"/>
+        </w:rPr>
+        <w:t>00</w:t>
       </w:r>
       <w:r>
         <w:rPr>
@@ -625,8 +608,9 @@
           <w:sz w:val="32"/>
           <w:szCs w:val="32"/>
           <w:u w:val="single"/>
-        </w:rPr>
-        <w:t>杨纯一</w:t>
+          <w:lang w:val="en-US" w:eastAsia="zh-CN"/>
+        </w:rPr>
+        <w:t>姓名</w:t>
       </w:r>
     </w:p>
     <w:p>
@@ -638,10 +622,11 @@
         </w:tabs>
         <w:textAlignment w:val="baseline"/>
         <w:rPr>
-          <w:rFonts w:ascii="Times New Roman" w:hAnsi="Times New Roman" w:eastAsia="黑体" w:cs="Times New Roman"/>
+          <w:rFonts w:hint="eastAsia" w:ascii="Times New Roman" w:hAnsi="Times New Roman" w:eastAsia="黑体" w:cs="Times New Roman"/>
           <w:sz w:val="32"/>
           <w:szCs w:val="32"/>
           <w:u w:val="single"/>
+          <w:lang w:val="en-US" w:eastAsia="zh-CN"/>
         </w:rPr>
       </w:pPr>
       <w:r>
@@ -674,9 +659,12 @@
           <w:sz w:val="32"/>
           <w:szCs w:val="32"/>
           <w:u w:val="single"/>
-        </w:rPr>
-        <w:t>高鹏</w:t>
-      </w:r>
+          <w:lang w:val="en-US" w:eastAsia="zh-CN"/>
+        </w:rPr>
+        <w:t>姓名</w:t>
+      </w:r>
+      <w:bookmarkStart w:id="0" w:name="_GoBack"/>
+      <w:bookmarkEnd w:id="0"/>
     </w:p>
     <w:p>
       <w:pPr>

</xml_diff>